<commit_message>
Simplify template footers to confidentiality and creation date
</commit_message>
<xml_diff>
--- a/deployment/branding/zivoe-letterhead.docx
+++ b/deployment/branding/zivoe-letterhead.docx
@@ -23,23 +23,7 @@
       <w:jc w:val="center"/>
     </w:pPr>
     <w:r>
-      <w:t>Internal · Draft · Current as of [date]</w:t>
-    </w:r>
-  </w:p>
-  <w:p>
-    <w:pPr>
-      <w:pStyle w:val="Footer"/>
-      <w:jc w:val="center"/>
-    </w:pPr>
-    <w:r>
-      <w:t xml:space="preserve">Contains information received under NDA · Page </w:t>
-    </w:r>
-    <w:r>
-      <w:fldChar w:fldCharType="begin"/>
-      <w:instrText xml:space="preserve"> PAGE </w:instrText>
-      <w:fldChar w:fldCharType="separate"/>
-      <w:t>1</w:t>
-      <w:fldChar w:fldCharType="end"/>
+      <w:t>Confidential · As of [creation date]</w:t>
     </w:r>
   </w:p>
 </w:ftr>

</xml_diff>